<commit_message>
Calibrar presupuesto formal IUTIRLA con cotizaciones reales Mercado Libre (62.46 USD)
</commit_message>
<xml_diff>
--- a/PROPUESTA_TECNICA_PRESUPUESTO_MIGATO_IUTIRLA.docx
+++ b/PROPUESTA_TECNICA_PRESUPUESTO_MIGATO_IUTIRLA.docx
@@ -244,7 +244,7 @@
     </w:p>
     <w:p>
       <w:pPr>
-        <w:spacing w:before="15" w:after="10" w:line="240" w:lineRule="auto"/>
+        <w:spacing w:before="12" w:after="8" w:line="240" w:lineRule="auto"/>
         <w:jc w:val="center"/>
       </w:pPr>
       <w:r>
@@ -259,7 +259,7 @@
     </w:p>
     <w:p>
       <w:pPr>
-        <w:spacing w:before="0" w:after="12" w:line="260" w:lineRule="auto"/>
+        <w:spacing w:before="0" w:after="10" w:line="260" w:lineRule="auto"/>
         <w:ind w:firstLine="567"/>
         <w:jc w:val="both"/>
       </w:pPr>
@@ -455,7 +455,7 @@
                 <w:rFonts w:ascii="Times New Roman" w:hAnsi="Times New Roman"/>
                 <w:sz w:val="17"/>
               </w:rPr>
-              <w:t>$900,00 USD</w:t>
+              <w:t>$862,46 USD</w:t>
             </w:r>
           </w:p>
         </w:tc>
@@ -615,7 +615,7 @@
                 <w:b/>
                 <w:sz w:val="17"/>
               </w:rPr>
-              <w:t>$1.194,00 USD</w:t>
+              <w:t>$1.156,46 USD</w:t>
             </w:r>
           </w:p>
         </w:tc>
@@ -623,12 +623,12 @@
     </w:tbl>
     <w:p>
       <w:pPr>
-        <w:spacing w:before="0" w:after="20" w:line="240" w:lineRule="auto"/>
-      </w:pPr>
-    </w:p>
-    <w:p>
-      <w:pPr>
-        <w:spacing w:before="15" w:after="10" w:line="240" w:lineRule="auto"/>
+        <w:spacing w:before="0" w:after="15" w:line="240" w:lineRule="auto"/>
+      </w:pPr>
+    </w:p>
+    <w:p>
+      <w:pPr>
+        <w:spacing w:before="12" w:after="8" w:line="240" w:lineRule="auto"/>
         <w:jc w:val="center"/>
       </w:pPr>
       <w:r>
@@ -643,7 +643,7 @@
     </w:p>
     <w:p>
       <w:pPr>
-        <w:spacing w:before="0" w:after="12" w:line="260" w:lineRule="auto"/>
+        <w:spacing w:before="0" w:after="10" w:line="260" w:lineRule="auto"/>
         <w:ind w:firstLine="567"/>
         <w:jc w:val="both"/>
       </w:pPr>
@@ -653,7 +653,7 @@
           <w:sz w:val="21"/>
           <w:szCs w:val="21"/>
         </w:rPr>
-        <w:t xml:space="preserve">Se descartan servidores industriales pesados de rack (Dell PowerEdge antiguos de $1.200 USD) debido a su alto consumo eléctrico (300W a 500W), ruido y baja autonomía en UPS. En su lugar, se implementa una estación de alto rendimiento Dell OptiPlex Core i7 de 8va Generación con 32 GB RAM DDR4, de consumo eficiente (65W) y almacenamiento 100% en estado sólido en arreglo espejo (RAID 1). A continuación se detallan los costos cotizados en Mercado Libre Venezuela:</w:t>
+        <w:t xml:space="preserve">Se descartan servidores industriales pesados de rack (Dell PowerEdge antiguos) debido a su excesivo consumo eléctrico (300W a 500W), ruido ensordecedor y escasa autonomía en UPS. En su lugar, se implementa una estación de trabajo Dell OptiPlex Core i7 con almacenamiento dual 100% en estado sólido en arreglo espejo (RAID 1) y consumo eficiente (65W). A continuación se detallan los costos cotizados en tiempo real en Mercado Libre Venezuela:</w:t>
       </w:r>
     </w:p>
     <w:tbl>
@@ -862,7 +862,7 @@
                 <w:rFonts w:ascii="Times New Roman" w:hAnsi="Times New Roman"/>
                 <w:sz w:val="17"/>
               </w:rPr>
-              <w:t>Core i7 8va Gen (i7-8700 6C/12T), 32 GB RAM DDR4, Chasis silencioso Torre/SFF (65W)</w:t>
+              <w:t>Core i7-6700 (3.40 GHz), 8 GB RAM DDR4 (expandible), chasis SFF silencioso (65W)</w:t>
             </w:r>
           </w:p>
         </w:tc>
@@ -900,7 +900,7 @@
                 <w:rFonts w:ascii="Times New Roman" w:hAnsi="Times New Roman"/>
                 <w:sz w:val="17"/>
               </w:rPr>
-              <w:t>$230,00</w:t>
+              <w:t>$215,00</w:t>
             </w:r>
           </w:p>
         </w:tc>
@@ -919,7 +919,7 @@
                 <w:rFonts w:ascii="Times New Roman" w:hAnsi="Times New Roman"/>
                 <w:sz w:val="17"/>
               </w:rPr>
-              <w:t>$230,00 USD</w:t>
+              <w:t>$215,00 USD</w:t>
             </w:r>
           </w:p>
         </w:tc>
@@ -959,7 +959,7 @@
                 <w:rFonts w:ascii="Times New Roman" w:hAnsi="Times New Roman"/>
                 <w:sz w:val="17"/>
               </w:rPr>
-              <w:t>Discos Sólidos SSD 1TB (RAID 1)</w:t>
+              <w:t>Discos Sólidos SSD 480GB (RAID 1)</w:t>
             </w:r>
           </w:p>
         </w:tc>
@@ -978,7 +978,7 @@
                 <w:rFonts w:ascii="Times New Roman" w:hAnsi="Times New Roman"/>
                 <w:sz w:val="17"/>
               </w:rPr>
-              <w:t>2x SSD 1TB SATA 2.5" Kingston KC600 / Crucial MX500 en Espejo (Sistema &amp; Base de Datos)</w:t>
+              <w:t>2x SSD SATA 2.5" 480GB WD Green en Espejo simétrico (Sistema y Base de Datos)</w:t>
             </w:r>
           </w:p>
         </w:tc>
@@ -1016,7 +1016,7 @@
                 <w:rFonts w:ascii="Times New Roman" w:hAnsi="Times New Roman"/>
                 <w:sz w:val="17"/>
               </w:rPr>
-              <w:t>$120,00</w:t>
+              <w:t>$109,99</w:t>
             </w:r>
           </w:p>
         </w:tc>
@@ -1035,7 +1035,7 @@
                 <w:rFonts w:ascii="Times New Roman" w:hAnsi="Times New Roman"/>
                 <w:sz w:val="17"/>
               </w:rPr>
-              <w:t>$240,00 USD</w:t>
+              <w:t>$219,98 USD</w:t>
             </w:r>
           </w:p>
         </w:tc>
@@ -1094,7 +1094,7 @@
                 <w:rFonts w:ascii="Times New Roman" w:hAnsi="Times New Roman"/>
                 <w:sz w:val="17"/>
               </w:rPr>
-              <w:t>MikroTik RB750Gr3 (Dual Core 880MHz, 5 Puertos Gigabit). Firewall y Failover automático</w:t>
+              <w:t>MikroTik RB750Gr3 (Dual Core 880MHz, 5 Puertos Gigabit). Firewall y túnel WireGuard</w:t>
             </w:r>
           </w:p>
         </w:tc>
@@ -1210,7 +1210,7 @@
                 <w:rFonts w:ascii="Times New Roman" w:hAnsi="Times New Roman"/>
                 <w:sz w:val="17"/>
               </w:rPr>
-              <w:t>Switch Hikvision / TP-Link 16 Puertos 10/100/1000 Mbps chasis metálico para distribución</w:t>
+              <w:t>TP-Link TL-SG1016D 16 Puertos 10/100/1000 Mbps chasis metálico para distribución</w:t>
             </w:r>
           </w:p>
         </w:tc>
@@ -1248,7 +1248,7 @@
                 <w:rFonts w:ascii="Times New Roman" w:hAnsi="Times New Roman"/>
                 <w:sz w:val="17"/>
               </w:rPr>
-              <w:t>$65,00</w:t>
+              <w:t>$99,96</w:t>
             </w:r>
           </w:p>
         </w:tc>
@@ -1267,7 +1267,7 @@
                 <w:rFonts w:ascii="Times New Roman" w:hAnsi="Times New Roman"/>
                 <w:sz w:val="17"/>
               </w:rPr>
-              <w:t>$65,00 USD</w:t>
+              <w:t>$99,96 USD</w:t>
             </w:r>
           </w:p>
         </w:tc>
@@ -1326,7 +1326,7 @@
                 <w:rFonts w:ascii="Times New Roman" w:hAnsi="Times New Roman"/>
                 <w:sz w:val="17"/>
               </w:rPr>
-              <w:t>Bobina 305 metros Cat6 interior alta velocidad + caja de 100 conectores RJ45 para la sala</w:t>
+              <w:t>Bobina 305m Cat6 STC interior 100% cobre para cableado estructurado de puestos</w:t>
             </w:r>
           </w:p>
         </w:tc>
@@ -1364,7 +1364,7 @@
                 <w:rFonts w:ascii="Times New Roman" w:hAnsi="Times New Roman"/>
                 <w:sz w:val="17"/>
               </w:rPr>
-              <w:t>$95,00</w:t>
+              <w:t>$72,99</w:t>
             </w:r>
           </w:p>
         </w:tc>
@@ -1383,7 +1383,7 @@
                 <w:rFonts w:ascii="Times New Roman" w:hAnsi="Times New Roman"/>
                 <w:sz w:val="17"/>
               </w:rPr>
-              <w:t>$95,00 USD</w:t>
+              <w:t>$72,99 USD</w:t>
             </w:r>
           </w:p>
         </w:tc>
@@ -1423,7 +1423,7 @@
                 <w:rFonts w:ascii="Times New Roman" w:hAnsi="Times New Roman"/>
                 <w:sz w:val="17"/>
               </w:rPr>
-              <w:t>UPS de Respaldo Eléctrico</w:t>
+              <w:t>Conectores RJ45 Cat6 (Caja 100 un.)</w:t>
             </w:r>
           </w:p>
         </w:tc>
@@ -1442,7 +1442,7 @@
                 <w:rFonts w:ascii="Times New Roman" w:hAnsi="Times New Roman"/>
                 <w:sz w:val="17"/>
               </w:rPr>
-              <w:t>UPS 1.200 VA a 1.500 VA con supresor de picos (45 a 60 min de autonomía por bajo consumo)</w:t>
+              <w:t>Conectores RJ45 Cat6 con contactos dorados de alta conductividad para patch cords</w:t>
             </w:r>
           </w:p>
         </w:tc>
@@ -1480,7 +1480,7 @@
                 <w:rFonts w:ascii="Times New Roman" w:hAnsi="Times New Roman"/>
                 <w:sz w:val="17"/>
               </w:rPr>
-              <w:t>$165,00</w:t>
+              <w:t>$6,62</w:t>
             </w:r>
           </w:p>
         </w:tc>
@@ -1499,7 +1499,7 @@
                 <w:rFonts w:ascii="Times New Roman" w:hAnsi="Times New Roman"/>
                 <w:sz w:val="17"/>
               </w:rPr>
-              <w:t>$165,00 USD</w:t>
+              <w:t>$6,62 USD</w:t>
             </w:r>
           </w:p>
         </w:tc>
@@ -1508,6 +1508,238 @@
         <w:tc>
           <w:tcPr>
             <w:tcW w:w="400" w:type="dxa"/>
+            <w:shd w:val="clear" w:color="auto"/>
+          </w:tcPr>
+          <w:p>
+            <w:pPr>
+              <w:spacing w:before="6" w:after="6" w:line="220" w:lineRule="auto"/>
+              <w:jc w:val="center"/>
+            </w:pPr>
+            <w:r>
+              <w:rPr>
+                <w:rFonts w:ascii="Times New Roman" w:hAnsi="Times New Roman"/>
+                <w:sz w:val="17"/>
+              </w:rPr>
+              <w:t>7</w:t>
+            </w:r>
+          </w:p>
+        </w:tc>
+        <w:tc>
+          <w:tcPr>
+            <w:tcW w:w="2400" w:type="dxa"/>
+            <w:shd w:val="clear" w:color="auto"/>
+          </w:tcPr>
+          <w:p>
+            <w:pPr>
+              <w:spacing w:before="6" w:after="6" w:line="220" w:lineRule="auto"/>
+              <w:jc w:val="left"/>
+            </w:pPr>
+            <w:r>
+              <w:rPr>
+                <w:rFonts w:ascii="Times New Roman" w:hAnsi="Times New Roman"/>
+                <w:sz w:val="17"/>
+              </w:rPr>
+              <w:t>Kit de Herramientas de Red UTP</w:t>
+            </w:r>
+          </w:p>
+        </w:tc>
+        <w:tc>
+          <w:tcPr>
+            <w:tcW w:w="3800" w:type="dxa"/>
+            <w:shd w:val="clear" w:color="auto"/>
+          </w:tcPr>
+          <w:p>
+            <w:pPr>
+              <w:spacing w:before="6" w:after="6" w:line="220" w:lineRule="auto"/>
+              <w:jc w:val="left"/>
+            </w:pPr>
+            <w:r>
+              <w:rPr>
+                <w:rFonts w:ascii="Times New Roman" w:hAnsi="Times New Roman"/>
+                <w:sz w:val="17"/>
+              </w:rPr>
+              <w:t>Kit completo: ponchadora/crimpeadora RJ45-RJ11 + tester UTP probador de cable</w:t>
+            </w:r>
+          </w:p>
+        </w:tc>
+        <w:tc>
+          <w:tcPr>
+            <w:tcW w:w="600" w:type="dxa"/>
+            <w:shd w:val="clear" w:color="auto"/>
+          </w:tcPr>
+          <w:p>
+            <w:pPr>
+              <w:spacing w:before="6" w:after="6" w:line="220" w:lineRule="auto"/>
+              <w:jc w:val="center"/>
+            </w:pPr>
+            <w:r>
+              <w:rPr>
+                <w:rFonts w:ascii="Times New Roman" w:hAnsi="Times New Roman"/>
+                <w:sz w:val="17"/>
+              </w:rPr>
+              <w:t>1</w:t>
+            </w:r>
+          </w:p>
+        </w:tc>
+        <w:tc>
+          <w:tcPr>
+            <w:tcW w:w="1100" w:type="dxa"/>
+            <w:shd w:val="clear" w:color="auto"/>
+          </w:tcPr>
+          <w:p>
+            <w:pPr>
+              <w:spacing w:before="6" w:after="6" w:line="220" w:lineRule="auto"/>
+              <w:jc w:val="right"/>
+            </w:pPr>
+            <w:r>
+              <w:rPr>
+                <w:rFonts w:ascii="Times New Roman" w:hAnsi="Times New Roman"/>
+                <w:sz w:val="17"/>
+              </w:rPr>
+              <w:t>$12,50</w:t>
+            </w:r>
+          </w:p>
+        </w:tc>
+        <w:tc>
+          <w:tcPr>
+            <w:tcW w:w="1300" w:type="dxa"/>
+            <w:shd w:val="clear" w:color="auto"/>
+          </w:tcPr>
+          <w:p>
+            <w:pPr>
+              <w:spacing w:before="6" w:after="6" w:line="220" w:lineRule="auto"/>
+              <w:jc w:val="right"/>
+            </w:pPr>
+            <w:r>
+              <w:rPr>
+                <w:rFonts w:ascii="Times New Roman" w:hAnsi="Times New Roman"/>
+                <w:sz w:val="17"/>
+              </w:rPr>
+              <w:t>$12,50 USD</w:t>
+            </w:r>
+          </w:p>
+        </w:tc>
+      </w:tr>
+      <w:tr>
+        <w:tc>
+          <w:tcPr>
+            <w:tcW w:w="400" w:type="dxa"/>
+            <w:shd w:val="clear" w:color="auto"/>
+          </w:tcPr>
+          <w:p>
+            <w:pPr>
+              <w:spacing w:before="6" w:after="6" w:line="220" w:lineRule="auto"/>
+              <w:jc w:val="center"/>
+            </w:pPr>
+            <w:r>
+              <w:rPr>
+                <w:rFonts w:ascii="Times New Roman" w:hAnsi="Times New Roman"/>
+                <w:sz w:val="17"/>
+              </w:rPr>
+              <w:t>8</w:t>
+            </w:r>
+          </w:p>
+        </w:tc>
+        <w:tc>
+          <w:tcPr>
+            <w:tcW w:w="2400" w:type="dxa"/>
+            <w:shd w:val="clear" w:color="auto"/>
+          </w:tcPr>
+          <w:p>
+            <w:pPr>
+              <w:spacing w:before="6" w:after="6" w:line="220" w:lineRule="auto"/>
+              <w:jc w:val="left"/>
+            </w:pPr>
+            <w:r>
+              <w:rPr>
+                <w:rFonts w:ascii="Times New Roman" w:hAnsi="Times New Roman"/>
+                <w:sz w:val="17"/>
+              </w:rPr>
+              <w:t>UPS de Respaldo Eléctrico 1.200 VA</w:t>
+            </w:r>
+          </w:p>
+        </w:tc>
+        <w:tc>
+          <w:tcPr>
+            <w:tcW w:w="3800" w:type="dxa"/>
+            <w:shd w:val="clear" w:color="auto"/>
+          </w:tcPr>
+          <w:p>
+            <w:pPr>
+              <w:spacing w:before="6" w:after="6" w:line="220" w:lineRule="auto"/>
+              <w:jc w:val="left"/>
+            </w:pPr>
+            <w:r>
+              <w:rPr>
+                <w:rFonts w:ascii="Times New Roman" w:hAnsi="Times New Roman"/>
+                <w:sz w:val="17"/>
+              </w:rPr>
+              <w:t>UPS Epcom EPU1200LCD 1.200 VA con pantalla digital interactiva y regulador AVR</w:t>
+            </w:r>
+          </w:p>
+        </w:tc>
+        <w:tc>
+          <w:tcPr>
+            <w:tcW w:w="600" w:type="dxa"/>
+            <w:shd w:val="clear" w:color="auto"/>
+          </w:tcPr>
+          <w:p>
+            <w:pPr>
+              <w:spacing w:before="6" w:after="6" w:line="220" w:lineRule="auto"/>
+              <w:jc w:val="center"/>
+            </w:pPr>
+            <w:r>
+              <w:rPr>
+                <w:rFonts w:ascii="Times New Roman" w:hAnsi="Times New Roman"/>
+                <w:sz w:val="17"/>
+              </w:rPr>
+              <w:t>1</w:t>
+            </w:r>
+          </w:p>
+        </w:tc>
+        <w:tc>
+          <w:tcPr>
+            <w:tcW w:w="1100" w:type="dxa"/>
+            <w:shd w:val="clear" w:color="auto"/>
+          </w:tcPr>
+          <w:p>
+            <w:pPr>
+              <w:spacing w:before="6" w:after="6" w:line="220" w:lineRule="auto"/>
+              <w:jc w:val="right"/>
+            </w:pPr>
+            <w:r>
+              <w:rPr>
+                <w:rFonts w:ascii="Times New Roman" w:hAnsi="Times New Roman"/>
+                <w:sz w:val="17"/>
+              </w:rPr>
+              <w:t>$130,41</w:t>
+            </w:r>
+          </w:p>
+        </w:tc>
+        <w:tc>
+          <w:tcPr>
+            <w:tcW w:w="1300" w:type="dxa"/>
+            <w:shd w:val="clear" w:color="auto"/>
+          </w:tcPr>
+          <w:p>
+            <w:pPr>
+              <w:spacing w:before="6" w:after="6" w:line="220" w:lineRule="auto"/>
+              <w:jc w:val="right"/>
+            </w:pPr>
+            <w:r>
+              <w:rPr>
+                <w:rFonts w:ascii="Times New Roman" w:hAnsi="Times New Roman"/>
+                <w:sz w:val="17"/>
+              </w:rPr>
+              <w:t>$130,41 USD</w:t>
+            </w:r>
+          </w:p>
+        </w:tc>
+      </w:tr>
+      <w:tr>
+        <w:tc>
+          <w:tcPr>
+            <w:tcW w:w="400" w:type="dxa"/>
             <w:shd w:val="clear" w:color="auto" w:fill="F5F5F5"/>
           </w:tcPr>
           <w:p>
@@ -1561,7 +1793,7 @@
                 <w:b/>
                 <w:sz w:val="17"/>
               </w:rPr>
-              <w:t>Equipamiento completo de cómputo, almacenamiento RAID, red y protección eléctrica</w:t>
+              <w:t>Dotación completa de cómputo, almacenamiento RAID 1, red y respaldo eléctrico</w:t>
             </w:r>
           </w:p>
         </w:tc>
@@ -1621,7 +1853,7 @@
                 <w:b/>
                 <w:sz w:val="17"/>
               </w:rPr>
-              <w:t>$900,00 USD</w:t>
+              <w:t>$862,46 USD</w:t>
             </w:r>
           </w:p>
         </w:tc>
@@ -1640,7 +1872,7 @@
           <w:szCs w:val="16"/>
           <w:color w:val="444444"/>
         </w:rPr>
-        <w:t>* Nota Aclaratoria de Hardware: Se eliminaron las bandejas costosas (caddys propietarios de $25 c/u) y los discos mecánicos lentos. Los dos SSD se conectan directamente en las bahías y puertos SATA de fábrica de la placa OptiPlex, ahorrando $470 USD de forma inmediata.</w:t>
+        <w:t>* Nota Técnica sobre Almacenamiento (SATA vs. M.2 NVMe): La placa base del Dell OptiPlex 5040 posee una sola ranura M.2 de almacenamiento y dos puertos SATA III. Para asegurar redundancia simétrica RAID 1 (espejo en tiempo real) sin adaptadores PCIe adicionales ni sobrecalentamiento en chasis SFF, se emplean dos discos SSD SATA 2.5" nativos.</w:t>
       </w:r>
     </w:p>
     <w:p>
@@ -1793,7 +2025,7 @@
           <w:sz w:val="21"/>
           <w:szCs w:val="21"/>
         </w:rPr>
-        <w:t xml:space="preserve">Se recomienda formalmente la aprobación del presupuesto físico de $900,00 USD para la dotación de la Sala Situacional y la suscripción del Servidor Cloud VPS ($24,50 USD/mes), otorgando a MIGATO una plataforma territorial moderna, de máxima velocidad y blindada contra fallas. Nota de Seguridad: El sistema de cámaras de videovigilancia (CCTV) se cotizará por separado más adelante según lo instruido; no obstante, el switch de 16 puertos y la bobina de cable Cat6 presupuestados en este documento ya dejan instalados los puntos de red requeridos.</w:t>
+        <w:t xml:space="preserve">Se recomienda formalmente la aprobación del presupuesto físico de $862,46 USD para la dotación de la Sala Situacional y la suscripción del Servidor Cloud VPS ($24,50 USD/mes), otorgando a MIGATO una plataforma territorial moderna, de máxima velocidad y blindada contra fallas. Nota de Seguridad: El sistema de cámaras de videovigilancia (CCTV) se cotizará por separado más adelante según lo instruido; no obstante, el switch de 16 puertos, el kit de herramientas y la bobina Cat6 presupuestados en este documento ya dejan instalados los puntos de red requeridos.</w:t>
       </w:r>
     </w:p>
     <w:p>

</xml_diff>

<commit_message>
fix: corregir total de resumen a 862.46 USD eliminando proyeccion anual forzada de VPS
</commit_message>
<xml_diff>
--- a/PROPUESTA_TECNICA_PRESUPUESTO_MIGATO_IUTIRLA.docx
+++ b/PROPUESTA_TECNICA_PRESUPUESTO_MIGATO_IUTIRLA.docx
@@ -555,7 +555,7 @@
                 <w:b/>
                 <w:sz w:val="17"/>
               </w:rPr>
-              <w:t>TOTAL INVERSIÓN INTEGRAL</w:t>
+              <w:t>TOTAL INVERSIÓN INICIAL (EQUIPOS)</w:t>
             </w:r>
           </w:p>
         </w:tc>
@@ -575,7 +575,7 @@
                 <w:b/>
                 <w:sz w:val="17"/>
               </w:rPr>
-              <w:t>Equipos físicos + 1 año de Servidor Cloud</w:t>
+              <w:t>Pago Único (Dotación Completa)</w:t>
             </w:r>
           </w:p>
         </w:tc>
@@ -595,7 +595,7 @@
                 <w:b/>
                 <w:sz w:val="17"/>
               </w:rPr>
-              <w:t>Sala Situacional + Cobertura Total</w:t>
+              <w:t>Sala Situacional + Puesta en Marcha</w:t>
             </w:r>
           </w:p>
         </w:tc>
@@ -615,7 +615,7 @@
                 <w:b/>
                 <w:sz w:val="17"/>
               </w:rPr>
-              <w:t>$1.156,46 USD</w:t>
+              <w:t>$862,46 USD</w:t>
             </w:r>
           </w:p>
         </w:tc>
@@ -623,7 +623,23 @@
     </w:tbl>
     <w:p>
       <w:pPr>
-        <w:spacing w:before="0" w:after="12" w:line="240" w:lineRule="auto"/>
+        <w:spacing w:before="6" w:after="20" w:line="200" w:lineRule="auto"/>
+        <w:jc w:val="both"/>
+      </w:pPr>
+      <w:r>
+        <w:rPr>
+          <w:rFonts w:ascii="Times New Roman" w:hAnsi="Times New Roman"/>
+          <w:i/>
+          <w:sz w:val="16"/>
+          <w:szCs w:val="16"/>
+          <w:color w:val="444444"/>
+        </w:rPr>
+        <w:t>* Nota: El Servidor Cloud VPS constituye un costo operativo recurrente de $24,50 USD/mes pagadero mes a mes según el período de campaña.</w:t>
+      </w:r>
+    </w:p>
+    <w:p>
+      <w:pPr>
+        <w:spacing w:before="0" w:after="10" w:line="240" w:lineRule="auto"/>
       </w:pPr>
     </w:p>
     <w:p>

</xml_diff>

<commit_message>
docs: ajustar terminologia a presupuesto estimativo con valores referenciales de mercado (no cotizacion vinculante)
</commit_message>
<xml_diff>
--- a/PROPUESTA_TECNICA_PRESUPUESTO_MIGATO_IUTIRLA.docx
+++ b/PROPUESTA_TECNICA_PRESUPUESTO_MIGATO_IUTIRLA.docx
@@ -669,7 +669,7 @@
           <w:sz w:val="21"/>
           <w:szCs w:val="21"/>
         </w:rPr>
-        <w:t xml:space="preserve">Se descartan servidores industriales pesados de rack (Dell PowerEdge antiguos) debido a su excesivo consumo eléctrico (300W a 500W), ruido ensordecedor y escasa autonomía en UPS. En su lugar, se implementa una estación de trabajo Dell OptiPlex Core i7 con almacenamiento dual 100% en estado sólido en arreglo espejo (RAID 1) y consumo eficiente (65W). A continuación se detallan los costos cotizados en tiempo real en Mercado Libre Venezuela:</w:t>
+        <w:t xml:space="preserve">Se descartan servidores industriales pesados de rack (Dell PowerEdge antiguos) debido a su excesivo consumo eléctrico (300W a 500W), ruido ensordecedor y escasa autonomía en UPS. En su lugar, se implementa una estación de trabajo Dell OptiPlex Core i7 con almacenamiento dual 100% en estado sólido en arreglo espejo (RAID 1) y consumo eficiente (65W). A continuación se presenta el desglose presupuestario estimado a partir de valores referenciales del mercado nacional (precios referenciales sujetos a disponibilidad de proveedores al momento de la compra):</w:t>
       </w:r>
     </w:p>
     <w:tbl>
@@ -791,7 +791,7 @@
           <w:p>
             <w:pPr>
               <w:spacing w:before="10" w:after="10" w:line="220" w:lineRule="auto"/>
-              <w:jc w:val="right"/>
+              <w:jc w:val="left"/>
             </w:pPr>
             <w:r>
               <w:rPr>
@@ -799,7 +799,7 @@
                 <w:b/>
                 <w:sz w:val="17"/>
               </w:rPr>
-              <w:t>Costo Unit.</w:t>
+              <w:t>Ref. Unit.</w:t>
             </w:r>
           </w:p>
         </w:tc>
@@ -819,7 +819,7 @@
                 <w:b/>
                 <w:sz w:val="17"/>
               </w:rPr>
-              <w:t>Total (USD)</w:t>
+              <w:t>Total Estimado</w:t>
             </w:r>
           </w:p>
         </w:tc>
@@ -1789,7 +1789,7 @@
                 <w:b/>
                 <w:sz w:val="17"/>
               </w:rPr>
-              <w:t>TOTAL EQUIPAMIENTO FÍSICO</w:t>
+              <w:t>TOTAL PRESUPUESTO ESTIMADO</w:t>
             </w:r>
           </w:p>
         </w:tc>
@@ -1888,7 +1888,7 @@
           <w:szCs w:val="16"/>
           <w:color w:val="444444"/>
         </w:rPr>
-        <w:t>* Nota Técnica sobre Almacenamiento (SATA vs. M.2 NVMe): La placa base del Dell OptiPlex 5040 posee una sola ranura M.2 de almacenamiento y dos puertos SATA III. Para asegurar redundancia simétrica RAID 1 (espejo en tiempo real) sin adaptadores PCIe adicionales ni sobrecalentamiento en chasis SFF, se emplean dos discos SSD SATA 2.5" nativos.</w:t>
+        <w:t>* Nota de Presupuesto: Los valores reflejados corresponden a un presupuesto estimativo con precios referenciales de mercado y no constituyen una cotización formal ni oferta comercial vinculante de un proveedor en específico. Placa OptiPlex 5040 posee 1 slot M.2 y 2 puertos SATA III; para RAID 1 simétrico estable sin recalentamiento en SFF, se emplean dos discos SSD SATA nativos.</w:t>
       </w:r>
     </w:p>
     <w:p>
@@ -2041,7 +2041,7 @@
           <w:sz w:val="21"/>
           <w:szCs w:val="21"/>
         </w:rPr>
-        <w:t xml:space="preserve">Se recomienda formalmente la aprobación del presupuesto físico de $862,46 USD para la dotación de la Sala Situacional y la suscripción del Servidor Cloud VPS ($24,50 USD/mes), otorgando a MIGATO una plataforma territorial moderna, de máxima velocidad y blindada contra fallas. Nota de Seguridad: El sistema de cámaras de videovigilancia (CCTV) se cotizará por separado más adelante según lo instruido; no obstante, el switch de 16 puertos, el kit de herramientas y la bobina Cat6 presupuestados en este documento ya dejan instalados los puntos de red requeridos.</w:t>
+        <w:t xml:space="preserve">Se recomienda formalmente la aprobación del presupuesto estimado de $862,46 USD para la dotación de la Sala Situacional y la suscripción del Servidor Cloud VPS ($24,50 USD/mes), otorgando a MIGATO una plataforma territorial moderna, de máxima velocidad y blindada contra fallas. Nota de Seguridad: El sistema de cámaras de videovigilancia (CCTV) se presupuestará por separado más adelante según lo instruido; no obstante, el switch de 16 puertos, el kit de herramientas y la bobina Cat6 presupuestados en este documento ya dejan instalados los puntos de red requeridos.</w:t>
       </w:r>
     </w:p>
     <w:p>

</xml_diff>

<commit_message>
docs: enfocar presupuesto 100% en equipamiento fisico y puesta en marcha de sala situacional (62.46 USD)
</commit_message>
<xml_diff>
--- a/PROPUESTA_TECNICA_PRESUPUESTO_MIGATO_IUTIRLA.docx
+++ b/PROPUESTA_TECNICA_PRESUPUESTO_MIGATO_IUTIRLA.docx
@@ -123,7 +123,7 @@
           <w:sz w:val="25"/>
           <w:szCs w:val="25"/>
         </w:rPr>
-        <w:t>PROPUESTA TÉCNICA Y PRESUPUESTO DE INFRAESTRUCTURA: SERVIDOR LOCAL Y NUBE</w:t>
+        <w:t>PROPUESTA TÉCNICA Y PRESUPUESTO ESTIMADO DE EQUIPAMIENTO FÍSICO: SALA SITUACIONAL MATURÍN</w:t>
       </w:r>
     </w:p>
     <w:p>
@@ -137,7 +137,7 @@
           <w:sz w:val="21"/>
           <w:szCs w:val="21"/>
         </w:rPr>
-        <w:t>Informe Técnico-Económico para la Puesta en Marcha de la Sala Situacional de Campaña, Servidor Físico RAID 1, Gateway MikroTik y Servidor Cloud VPS MIGATO 2026</w:t>
+        <w:t>Informe Técnico-Económico de Dotación de Cómputo, Almacenamiento Local RAID 1, Electrónica de Red y Respaldo Eléctrico para la Plataforma Electoral MIGATO 2026</w:t>
       </w:r>
     </w:p>
     <w:p>
@@ -214,7 +214,7 @@
     </w:p>
     <w:p>
       <w:pPr>
-        <w:spacing w:before="10" w:after="12" w:line="240" w:lineRule="auto"/>
+        <w:spacing w:before="10" w:after="8" w:line="240" w:lineRule="auto"/>
         <w:jc w:val="center"/>
       </w:pPr>
       <w:r>
@@ -224,12 +224,12 @@
           <w:sz w:val="22"/>
           <w:szCs w:val="22"/>
         </w:rPr>
-        <w:t>INTRODUCCIÓN Y PREMISA OPERATIVA</w:t>
-      </w:r>
-    </w:p>
-    <w:p>
-      <w:pPr>
-        <w:spacing w:before="0" w:after="14" w:line="260" w:lineRule="auto"/>
+        <w:t>INTRODUCCIÓN Y PREMISAS DE INSTALACIÓN</w:t>
+      </w:r>
+    </w:p>
+    <w:p>
+      <w:pPr>
+        <w:spacing w:before="0" w:after="12" w:line="260" w:lineRule="auto"/>
         <w:ind w:firstLine="567"/>
         <w:jc w:val="both"/>
       </w:pPr>
@@ -239,12 +239,12 @@
           <w:sz w:val="21"/>
           <w:szCs w:val="21"/>
         </w:rPr>
-        <w:t xml:space="preserve">El presente informe tiene como propósito exponer ante la directiva del partido y el comando de campaña la propuesta técnica y el presupuesto de dotación tecnológica, instalación y puesta en marcha para la Sala Situacional de Maturín y la plataforma electoral del Movimiento Independiente Ganamos Todos (MIGATO) en el Estado Monagas. Premisa de Alcance: El presente proyecto se enfoca estrictamente en el equipamiento de cómputo, almacenamiento RAID 1, electrónica de red y conectividad lógica, bajo la premisa de que la sede ya cuenta con el centro de cómputo acondicionado (rack de comunicaciones existente y acometida eléctrica base). De requerirse obras civiles adicionales (suministro de rack de piso, marquesinas o cableado de potencia), se presupuestarán en una fase anexa independiente.</w:t>
-      </w:r>
-    </w:p>
-    <w:p>
-      <w:pPr>
-        <w:spacing w:before="10" w:after="6" w:line="240" w:lineRule="auto"/>
+        <w:t xml:space="preserve">El presente informe técnico-económico tiene como propósito someter a consideración de la directiva regional del Movimiento Independiente Ganamos Todos (MIGATO) y el comando de campaña de José Gregorio "El Gato" Briceño el presupuesto estimado de dotación física, instalación y puesta en marcha de la Sala Situacional de Maturín. Premisa Operativa de Alcance: La propuesta se circunscribe de manera estricta a la dotación de hardware de cómputo, almacenamiento masivo redundante en espejo (RAID 1), conmutación de red estructurada y respaldo eléctrico. Se asume como premisa que la sede central ya dispone del área de centro de cómputo, rack de comunicaciones y acometida eléctrica operativa. En caso de que la dirección requiera adecuaciones civiles complementarias (suministro de racks de piso adicionales, marquesinas de tendido perimetral o cableado de potencia), estas se canalizarán en un anexo independiente, al igual que los servicios en la nube (Cloud VPS, dominios y telefonía IP) que cuentan con su respectivo presupuesto especializado.</w:t>
+      </w:r>
+    </w:p>
+    <w:p>
+      <w:pPr>
+        <w:spacing w:before="8" w:after="6" w:line="240" w:lineRule="auto"/>
         <w:jc w:val="center"/>
       </w:pPr>
       <w:r>
@@ -254,7 +254,7 @@
           <w:sz w:val="22"/>
           <w:szCs w:val="22"/>
         </w:rPr>
-        <w:t>1. RESUMEN EJECUTIVO DE INVERSIÓN</w:t>
+        <w:t>1. DESGLOSE PRESUPUESTARIO DE EQUIPAMIENTO FÍSICO</w:t>
       </w:r>
     </w:p>
     <w:p>
@@ -269,407 +269,7 @@
           <w:sz w:val="21"/>
           <w:szCs w:val="21"/>
         </w:rPr>
-        <w:t xml:space="preserve">Para lograr un despliegue equilibrado, la inversión se divide en dos componentes: 1) Equipamiento físico de sala para procesamiento local de alta velocidad sin saturar el ancho de banda; y 2) Servidor en la nube (Cloud VPS) con disponibilidad 24/7 para el reporte móvil de los testigos en centros electorales.</w:t>
-      </w:r>
-    </w:p>
-    <w:tbl>
-      <w:tblPr>
-        <w:tblW w:w="0" w:type="auto"/>
-        <w:jc w:val="center"/>
-        <w:tblBorders>
-          <w:top w:val="single" w:sz="6" w:space="0" w:color="000000"/>
-          <w:left w:val="none"/>
-          <w:bottom w:val="single" w:sz="6" w:space="0" w:color="000000"/>
-          <w:right w:val="none"/>
-          <w:insideH w:val="single" w:sz="4" w:space="0" w:color="CCCCCC"/>
-          <w:insideV w:val="none"/>
-        </w:tblBorders>
-        <w:tblCellMar>
-          <w:top w:w="40" w:type="dxa"/>
-          <w:left w:w="80" w:type="dxa"/>
-          <w:bottom w:w="40" w:type="dxa"/>
-          <w:right w:w="80" w:type="dxa"/>
-        </w:tblCellMar>
-      </w:tblPr>
-      <w:tblGrid>
-        <w:gridCol w:w="3000"/>
-        <w:gridCol w:w="2400"/>
-        <w:gridCol w:w="2400"/>
-        <w:gridCol w:w="1800"/>
-      </w:tblGrid>
-      <w:tr>
-        <w:trPr>
-          <w:tblHeader/>
-        </w:trPr>
-        <w:tc>
-          <w:tcPr>
-            <w:tcW w:w="3000" w:type="dxa"/>
-            <w:shd w:val="clear" w:color="auto" w:fill="EAEAEA"/>
-          </w:tcPr>
-          <w:p>
-            <w:pPr>
-              <w:spacing w:before="10" w:after="10" w:line="220" w:lineRule="auto"/>
-              <w:jc w:val="left"/>
-            </w:pPr>
-            <w:r>
-              <w:rPr>
-                <w:rFonts w:ascii="Times New Roman" w:hAnsi="Times New Roman"/>
-                <w:b/>
-                <w:sz w:val="17"/>
-              </w:rPr>
-              <w:t>Componente / Ámbito</w:t>
-            </w:r>
-          </w:p>
-        </w:tc>
-        <w:tc>
-          <w:tcPr>
-            <w:tcW w:w="2400" w:type="dxa"/>
-            <w:shd w:val="clear" w:color="auto" w:fill="EAEAEA"/>
-          </w:tcPr>
-          <w:p>
-            <w:pPr>
-              <w:spacing w:before="10" w:after="10" w:line="220" w:lineRule="auto"/>
-              <w:jc w:val="right"/>
-            </w:pPr>
-            <w:r>
-              <w:rPr>
-                <w:rFonts w:ascii="Times New Roman" w:hAnsi="Times New Roman"/>
-                <w:b/>
-                <w:sz w:val="17"/>
-              </w:rPr>
-              <w:t>Modalidad de Inversión</w:t>
-            </w:r>
-          </w:p>
-        </w:tc>
-        <w:tc>
-          <w:tcPr>
-            <w:tcW w:w="2400" w:type="dxa"/>
-            <w:shd w:val="clear" w:color="auto" w:fill="EAEAEA"/>
-          </w:tcPr>
-          <w:p>
-            <w:pPr>
-              <w:spacing w:before="10" w:after="10" w:line="220" w:lineRule="auto"/>
-              <w:jc w:val="left"/>
-            </w:pPr>
-            <w:r>
-              <w:rPr>
-                <w:rFonts w:ascii="Times New Roman" w:hAnsi="Times New Roman"/>
-                <w:b/>
-                <w:sz w:val="17"/>
-              </w:rPr>
-              <w:t>Cobertura Operativa</w:t>
-            </w:r>
-          </w:p>
-        </w:tc>
-        <w:tc>
-          <w:tcPr>
-            <w:tcW w:w="1800" w:type="dxa"/>
-            <w:shd w:val="clear" w:color="auto" w:fill="EAEAEA"/>
-          </w:tcPr>
-          <w:p>
-            <w:pPr>
-              <w:spacing w:before="10" w:after="10" w:line="220" w:lineRule="auto"/>
-              <w:jc w:val="right"/>
-            </w:pPr>
-            <w:r>
-              <w:rPr>
-                <w:rFonts w:ascii="Times New Roman" w:hAnsi="Times New Roman"/>
-                <w:b/>
-                <w:sz w:val="17"/>
-              </w:rPr>
-              <w:t>Inversión (USD)</w:t>
-            </w:r>
-          </w:p>
-        </w:tc>
-      </w:tr>
-      <w:tr>
-        <w:tc>
-          <w:tcPr>
-            <w:tcW w:w="3000" w:type="dxa"/>
-            <w:shd w:val="clear" w:color="auto"/>
-          </w:tcPr>
-          <w:p>
-            <w:pPr>
-              <w:spacing w:before="6" w:after="6" w:line="220" w:lineRule="auto"/>
-              <w:jc w:val="left"/>
-            </w:pPr>
-            <w:r>
-              <w:rPr>
-                <w:rFonts w:ascii="Times New Roman" w:hAnsi="Times New Roman"/>
-                <w:sz w:val="17"/>
-              </w:rPr>
-              <w:t>A. Equipamiento Físico de Sala</w:t>
-            </w:r>
-          </w:p>
-        </w:tc>
-        <w:tc>
-          <w:tcPr>
-            <w:tcW w:w="2400" w:type="dxa"/>
-            <w:shd w:val="clear" w:color="auto"/>
-          </w:tcPr>
-          <w:p>
-            <w:pPr>
-              <w:spacing w:before="6" w:after="6" w:line="220" w:lineRule="auto"/>
-              <w:jc w:val="left"/>
-            </w:pPr>
-            <w:r>
-              <w:rPr>
-                <w:rFonts w:ascii="Times New Roman" w:hAnsi="Times New Roman"/>
-                <w:sz w:val="17"/>
-              </w:rPr>
-              <w:t>Pago Único (Hardware)</w:t>
-            </w:r>
-          </w:p>
-        </w:tc>
-        <w:tc>
-          <w:tcPr>
-            <w:tcW w:w="2400" w:type="dxa"/>
-            <w:shd w:val="clear" w:color="auto"/>
-          </w:tcPr>
-          <w:p>
-            <w:pPr>
-              <w:spacing w:before="6" w:after="6" w:line="220" w:lineRule="auto"/>
-              <w:jc w:val="left"/>
-            </w:pPr>
-            <w:r>
-              <w:rPr>
-                <w:rFonts w:ascii="Times New Roman" w:hAnsi="Times New Roman"/>
-                <w:sz w:val="17"/>
-              </w:rPr>
-              <w:t>45 a 60 min de respaldo en apagones</w:t>
-            </w:r>
-          </w:p>
-        </w:tc>
-        <w:tc>
-          <w:tcPr>
-            <w:tcW w:w="1800" w:type="dxa"/>
-            <w:shd w:val="clear" w:color="auto"/>
-          </w:tcPr>
-          <w:p>
-            <w:pPr>
-              <w:spacing w:before="6" w:after="6" w:line="220" w:lineRule="auto"/>
-              <w:jc w:val="right"/>
-            </w:pPr>
-            <w:r>
-              <w:rPr>
-                <w:rFonts w:ascii="Times New Roman" w:hAnsi="Times New Roman"/>
-                <w:sz w:val="17"/>
-              </w:rPr>
-              <w:t>$862,46 USD</w:t>
-            </w:r>
-          </w:p>
-        </w:tc>
-      </w:tr>
-      <w:tr>
-        <w:tc>
-          <w:tcPr>
-            <w:tcW w:w="3000" w:type="dxa"/>
-            <w:shd w:val="clear" w:color="auto"/>
-          </w:tcPr>
-          <w:p>
-            <w:pPr>
-              <w:spacing w:before="6" w:after="6" w:line="220" w:lineRule="auto"/>
-              <w:jc w:val="left"/>
-            </w:pPr>
-            <w:r>
-              <w:rPr>
-                <w:rFonts w:ascii="Times New Roman" w:hAnsi="Times New Roman"/>
-                <w:sz w:val="17"/>
-              </w:rPr>
-              <w:t>B. Servidor Cloud VPS (Nube)</w:t>
-            </w:r>
-          </w:p>
-        </w:tc>
-        <w:tc>
-          <w:tcPr>
-            <w:tcW w:w="2400" w:type="dxa"/>
-            <w:shd w:val="clear" w:color="auto"/>
-          </w:tcPr>
-          <w:p>
-            <w:pPr>
-              <w:spacing w:before="6" w:after="6" w:line="220" w:lineRule="auto"/>
-              <w:jc w:val="left"/>
-            </w:pPr>
-            <w:r>
-              <w:rPr>
-                <w:rFonts w:ascii="Times New Roman" w:hAnsi="Times New Roman"/>
-                <w:sz w:val="17"/>
-              </w:rPr>
-              <w:t>Suscripción Mensual</w:t>
-            </w:r>
-          </w:p>
-        </w:tc>
-        <w:tc>
-          <w:tcPr>
-            <w:tcW w:w="2400" w:type="dxa"/>
-            <w:shd w:val="clear" w:color="auto"/>
-          </w:tcPr>
-          <w:p>
-            <w:pPr>
-              <w:spacing w:before="6" w:after="6" w:line="220" w:lineRule="auto"/>
-              <w:jc w:val="left"/>
-            </w:pPr>
-            <w:r>
-              <w:rPr>
-                <w:rFonts w:ascii="Times New Roman" w:hAnsi="Times New Roman"/>
-                <w:sz w:val="17"/>
-              </w:rPr>
-              <w:t>24/7 en línea para los 13 municipios</w:t>
-            </w:r>
-          </w:p>
-        </w:tc>
-        <w:tc>
-          <w:tcPr>
-            <w:tcW w:w="1800" w:type="dxa"/>
-            <w:shd w:val="clear" w:color="auto"/>
-          </w:tcPr>
-          <w:p>
-            <w:pPr>
-              <w:spacing w:before="6" w:after="6" w:line="220" w:lineRule="auto"/>
-              <w:jc w:val="right"/>
-            </w:pPr>
-            <w:r>
-              <w:rPr>
-                <w:rFonts w:ascii="Times New Roman" w:hAnsi="Times New Roman"/>
-                <w:sz w:val="17"/>
-              </w:rPr>
-              <w:t>$24,50 USD / mes</w:t>
-            </w:r>
-          </w:p>
-        </w:tc>
-      </w:tr>
-      <w:tr>
-        <w:tc>
-          <w:tcPr>
-            <w:tcW w:w="3000" w:type="dxa"/>
-            <w:shd w:val="clear" w:color="auto" w:fill="F5F5F5"/>
-          </w:tcPr>
-          <w:p>
-            <w:pPr>
-              <w:spacing w:before="6" w:after="6" w:line="220" w:lineRule="auto"/>
-              <w:jc w:val="left"/>
-            </w:pPr>
-            <w:r>
-              <w:rPr>
-                <w:rFonts w:ascii="Times New Roman" w:hAnsi="Times New Roman"/>
-                <w:b/>
-                <w:sz w:val="17"/>
-              </w:rPr>
-              <w:t>TOTAL INVERSIÓN INICIAL (EQUIPOS)</w:t>
-            </w:r>
-          </w:p>
-        </w:tc>
-        <w:tc>
-          <w:tcPr>
-            <w:tcW w:w="2400" w:type="dxa"/>
-            <w:shd w:val="clear" w:color="auto" w:fill="F5F5F5"/>
-          </w:tcPr>
-          <w:p>
-            <w:pPr>
-              <w:spacing w:before="6" w:after="6" w:line="220" w:lineRule="auto"/>
-              <w:jc w:val="left"/>
-            </w:pPr>
-            <w:r>
-              <w:rPr>
-                <w:rFonts w:ascii="Times New Roman" w:hAnsi="Times New Roman"/>
-                <w:b/>
-                <w:sz w:val="17"/>
-              </w:rPr>
-              <w:t>Pago Único (Dotación Completa)</w:t>
-            </w:r>
-          </w:p>
-        </w:tc>
-        <w:tc>
-          <w:tcPr>
-            <w:tcW w:w="2400" w:type="dxa"/>
-            <w:shd w:val="clear" w:color="auto" w:fill="F5F5F5"/>
-          </w:tcPr>
-          <w:p>
-            <w:pPr>
-              <w:spacing w:before="6" w:after="6" w:line="220" w:lineRule="auto"/>
-              <w:jc w:val="left"/>
-            </w:pPr>
-            <w:r>
-              <w:rPr>
-                <w:rFonts w:ascii="Times New Roman" w:hAnsi="Times New Roman"/>
-                <w:b/>
-                <w:sz w:val="17"/>
-              </w:rPr>
-              <w:t>Sala Situacional + Puesta en Marcha</w:t>
-            </w:r>
-          </w:p>
-        </w:tc>
-        <w:tc>
-          <w:tcPr>
-            <w:tcW w:w="1800" w:type="dxa"/>
-            <w:shd w:val="clear" w:color="auto" w:fill="F5F5F5"/>
-          </w:tcPr>
-          <w:p>
-            <w:pPr>
-              <w:spacing w:before="6" w:after="6" w:line="220" w:lineRule="auto"/>
-              <w:jc w:val="right"/>
-            </w:pPr>
-            <w:r>
-              <w:rPr>
-                <w:rFonts w:ascii="Times New Roman" w:hAnsi="Times New Roman"/>
-                <w:b/>
-                <w:sz w:val="17"/>
-              </w:rPr>
-              <w:t>$862,46 USD</w:t>
-            </w:r>
-          </w:p>
-        </w:tc>
-      </w:tr>
-    </w:tbl>
-    <w:p>
-      <w:pPr>
-        <w:spacing w:before="6" w:after="20" w:line="200" w:lineRule="auto"/>
-        <w:jc w:val="both"/>
-      </w:pPr>
-      <w:r>
-        <w:rPr>
-          <w:rFonts w:ascii="Times New Roman" w:hAnsi="Times New Roman"/>
-          <w:i/>
-          <w:sz w:val="16"/>
-          <w:szCs w:val="16"/>
-          <w:color w:val="444444"/>
-        </w:rPr>
-        <w:t>* Nota: El Servidor Cloud VPS constituye un costo operativo recurrente de $24,50 USD/mes pagadero mes a mes según el período de campaña.</w:t>
-      </w:r>
-    </w:p>
-    <w:p>
-      <w:pPr>
-        <w:spacing w:before="0" w:after="10" w:line="240" w:lineRule="auto"/>
-      </w:pPr>
-    </w:p>
-    <w:p>
-      <w:pPr>
-        <w:spacing w:before="10" w:after="6" w:line="240" w:lineRule="auto"/>
-        <w:jc w:val="center"/>
-      </w:pPr>
-      <w:r>
-        <w:rPr>
-          <w:rFonts w:ascii="Times New Roman" w:hAnsi="Times New Roman"/>
-          <w:b/>
-          <w:sz w:val="22"/>
-          <w:szCs w:val="22"/>
-        </w:rPr>
-        <w:t>2. DETALLE DE EQUIPAMIENTO E INSTALACIÓN (SALA SITUACIONAL)</w:t>
-      </w:r>
-    </w:p>
-    <w:p>
-      <w:pPr>
-        <w:spacing w:before="0" w:after="8" w:line="260" w:lineRule="auto"/>
-        <w:ind w:firstLine="567"/>
-        <w:jc w:val="both"/>
-      </w:pPr>
-      <w:r>
-        <w:rPr>
-          <w:rFonts w:ascii="Times New Roman" w:hAnsi="Times New Roman"/>
-          <w:sz w:val="21"/>
-          <w:szCs w:val="21"/>
-        </w:rPr>
-        <w:t xml:space="preserve">Se descartan servidores industriales pesados de rack (Dell PowerEdge antiguos) debido a su excesivo consumo eléctrico (300W a 500W), ruido ensordecedor y escasa autonomía en UPS. En su lugar, se implementa una estación de trabajo Dell OptiPlex Core i7 con almacenamiento dual 100% en estado sólido en arreglo espejo (RAID 1) y consumo eficiente (65W). A continuación se presenta el desglose presupuestario estimado a partir de valores referenciales del mercado nacional (precios referenciales sujetos a disponibilidad de proveedores al momento de la compra):</w:t>
+        <w:t xml:space="preserve">Se descarta el uso de servidores industriales antiguos de rack (Dell PowerEdge) por su alto consumo eléctrico (300W a 500W), ruido y rápida descarga de baterías. En su lugar, se implementa una estación de trabajo Dell OptiPlex Core i7 de alta eficiencia energética (65W) con almacenamiento simétrico en estado sólido. A continuación se detalla el presupuesto estimado con base en valores referenciales del mercado tecnológico nacional:</w:t>
       </w:r>
     </w:p>
     <w:tbl>
@@ -1110,7 +710,7 @@
                 <w:rFonts w:ascii="Times New Roman" w:hAnsi="Times New Roman"/>
                 <w:sz w:val="17"/>
               </w:rPr>
-              <w:t>MikroTik RB750Gr3 (Dual Core 880MHz, 5 Puertos Gigabit). Firewall y túnel WireGuard</w:t>
+              <w:t>MikroTik RB750Gr3 (Dual Core 880MHz, 5 Puertos Gigabit). Firewall y gestión de tráfico</w:t>
             </w:r>
           </w:p>
         </w:tc>
@@ -1789,7 +1389,7 @@
                 <w:b/>
                 <w:sz w:val="17"/>
               </w:rPr>
-              <w:t>TOTAL PRESUPUESTO ESTIMADO</w:t>
+              <w:t>TOTAL EQUIPAMIENTO FÍSICO</w:t>
             </w:r>
           </w:p>
         </w:tc>
@@ -1908,7 +1508,7 @@
           <w:sz w:val="22"/>
           <w:szCs w:val="22"/>
         </w:rPr>
-        <w:t>3. ARQUITECTURA: VANGUARDIA EN LA NUBE Y BÓVEDA FÍSICA</w:t>
+        <w:t>3. ARQUITECTURA DE LA BÓVEDA LOCAL DE DATOS (DATA VAULT)</w:t>
       </w:r>
     </w:p>
     <w:p>
@@ -1923,7 +1523,7 @@
           <w:sz w:val="21"/>
           <w:szCs w:val="21"/>
         </w:rPr>
-        <w:t xml:space="preserve">Para blindar la plataforma política contra sabotajes, bloqueos o apagones, la infraestructura opera bajo un modelo de dos capas: Vanguardia en la Nube (Front-line) y Bóveda Blindada en Físico (Data Vault):</w:t>
+        <w:t xml:space="preserve">Para garantizar que el comando de campaña disponga de una infraestructura resiliente, inconfiscable e inmune a contingencias externas, el despliegue físico se fundamenta en cuatro pilares de ingeniería:</w:t>
       </w:r>
     </w:p>
     <w:p>
@@ -1938,14 +1538,14 @@
           <w:b/>
           <w:sz w:val="20"/>
         </w:rPr>
-        <w:t xml:space="preserve">• 1. Vanguardia en la Nube (Cloud VPS Front-line): </w:t>
+        <w:t xml:space="preserve">• 1. Procesamiento Local Autónomo de Alta Velocidad: </w:t>
       </w:r>
       <w:r>
         <w:rPr>
           <w:rFonts w:ascii="Times New Roman" w:hAnsi="Times New Roman"/>
           <w:sz w:val="20"/>
         </w:rPr>
-        <w:t xml:space="preserve">Constituye la primera línea de recepción. Recibe el tráfico masivo de teléfonos de testigos en los 13 municipios, valida reportes y absorbe cualquier ataque cibernético (DDoS) sin exponer la dirección IP ni la ubicación física de la sede en Maturín.</w:t>
+        <w:t xml:space="preserve">La estación Dell OptiPlex Core i7 con 8 GB de memoria RAM DDR4 procesa localmente la cartografía electoral, el padrón de electores de Monagas y los tableros analíticos en pantallas de sala con tiempos de respuesta inmediatos y sin saturar el enlace de datos.</w:t>
       </w:r>
     </w:p>
     <w:p>
@@ -1960,14 +1560,14 @@
           <w:b/>
           <w:sz w:val="20"/>
         </w:rPr>
-        <w:t xml:space="preserve">• 2. Enlace Cifrado y Replicación Continua: </w:t>
+        <w:t xml:space="preserve">• 2. Bóveda Física en Espejo (Arreglo RAID 1): </w:t>
       </w:r>
       <w:r>
         <w:rPr>
           <w:rFonts w:ascii="Times New Roman" w:hAnsi="Times New Roman"/>
           <w:sz w:val="20"/>
         </w:rPr>
-        <w:t xml:space="preserve">El Servidor Cloud VPS retransmite las transacciones en tiempo real al computador Dell de la oficina en Maturín a través de un túnel seguro VPN WireGuard gestionado por el router MikroTik.</w:t>
+        <w:t xml:space="preserve">Toda información de mesas, electores y actas se graba de forma redundante y simultánea en dos discos de estado sólido independientes. Si cualquiera de las unidades sufriera un daño mecánico o lógico, el sistema continúa operando sin interrupción ni pérdida de un solo registro.</w:t>
       </w:r>
     </w:p>
     <w:p>
@@ -1982,14 +1582,14 @@
           <w:b/>
           <w:sz w:val="20"/>
         </w:rPr>
-        <w:t xml:space="preserve">• 3. Bóveda Física en Espejo (RAID 1): </w:t>
+        <w:t xml:space="preserve">• 3. Electrónica de Red Segura y Segmentada: </w:t>
       </w:r>
       <w:r>
         <w:rPr>
           <w:rFonts w:ascii="Times New Roman" w:hAnsi="Times New Roman"/>
           <w:sz w:val="20"/>
         </w:rPr>
-        <w:t xml:space="preserve">El computador Dell en sala graba cada voto y acta simultáneamente en sus dos unidades SSD. Si Conatel bloquea la nube o se corta el internet internacional, MIGATO conserva el 100% de la información físicamente en sus manos, inconfiscable e imborrable.</w:t>
+        <w:t xml:space="preserve">El router profesional MikroTik hEX administra la seguridad perimetral de la sala y prioriza el ancho de banda para las computadoras de digitación de actas, mientras que el switch Gigabit de 16 puertos interconecta de forma cableada y estable los puestos de trabajo.</w:t>
       </w:r>
     </w:p>
     <w:p>
@@ -2004,14 +1604,14 @@
           <w:b/>
           <w:sz w:val="20"/>
         </w:rPr>
-        <w:t xml:space="preserve">• 4. Respaldo Eléctrico y Autonomía Local: </w:t>
+        <w:t xml:space="preserve">• 4. Respaldo Energético Crítico ante Apagones: </w:t>
       </w:r>
       <w:r>
         <w:rPr>
           <w:rFonts w:ascii="Times New Roman" w:hAnsi="Times New Roman"/>
           <w:sz w:val="20"/>
         </w:rPr>
-        <w:t xml:space="preserve">En caso de corte eléctrico en Maturín, el UPS mantiene la estación Dell, el switch y el MikroTik operando durante 45 a 60 minutos. Si el corte persiste, la sala continúa procesando actas en red local por llamadas directas sin depender de la nube.</w:t>
+        <w:t xml:space="preserve">El UPS de 1.200 VA con regulador automático de voltaje (AVR) garantiza una ventana de autonomía de 45 a 60 minutos para el servidor y la electrónica de red durante cortes de energía, permitiendo mantener la sala operativa y protegiendo el equipamiento contra fluctuaciones de corriente.</w:t>
       </w:r>
     </w:p>
     <w:p>
@@ -2041,7 +1641,7 @@
           <w:sz w:val="21"/>
           <w:szCs w:val="21"/>
         </w:rPr>
-        <w:t xml:space="preserve">Se recomienda formalmente la aprobación del presupuesto estimado de $862,46 USD para la dotación de la Sala Situacional y la suscripción del Servidor Cloud VPS ($24,50 USD/mes), otorgando a MIGATO una plataforma territorial moderna, de máxima velocidad y blindada contra fallas. Nota de Seguridad: El sistema de cámaras de videovigilancia (CCTV) se presupuestará por separado más adelante según lo instruido; no obstante, el switch de 16 puertos, el kit de herramientas y la bobina Cat6 presupuestados en este documento ya dejan instalados los puntos de red requeridos.</w:t>
+        <w:t xml:space="preserve">Se recomienda formalmente a la dirección política del partido la aprobación del presupuesto estimado de $862,46 USD para la dotación e instalación del equipamiento físico de la Sala Situacional de Maturín. Esta inversión dotará a MIGATO de un centro de cómputo robusto, eficiente y bajo control 100% propio. Nota de Seguridad: El sistema de cámaras de videovigilancia (CCTV) se presupuestará por separado según lo acordado; no obstante, el switch de 16 puertos, la bobina Cat6 y el kit de herramientas presupuestados en este informe dejan instalados los puntos de red requeridos.</w:t>
       </w:r>
     </w:p>
     <w:p>

</xml_diff>